<commit_message>
Replace remaining AP wording in the apps and guides
- Names (Spot Test, Speed Challenge, Structures, Toolkit etc.) now say Eton
- Where AP meant the teacher: "your teacher"; AP's OneNote -> your Div's Class OneNote
- Sample sentences no longer name the teacher; AP Photo (news agency) kept
- Old saved test names still display correctly; saved test names in tests.txt updated
- Update hashes, versions.json and Olly guide PDF refreshed

Co-Authored-By: Claude Sonnet 5.5 <noreply@anthropic.com>
Claude-Session: https://claude.ai/code/session_01PtLNqJ6dBkTLNoYddvJHKa
</commit_message>
<xml_diff>
--- a/Word documents/Eton IGCSE French Approved Material.docx
+++ b/Word documents/Eton IGCSE French Approved Material.docx
@@ -34,7 +34,7 @@
           <w:sz w:val="30"/>
           <w:szCs w:val="30"/>
         </w:rPr>
-        <w:t xml:space="preserve">AP Approved Material</w:t>
+        <w:t xml:space="preserve">Eton Approved Material</w:t>
       </w:r>
     </w:p>
     <w:p>
@@ -9581,7 +9581,7 @@
         <w:spacing w:after="60"/>
       </w:pPr>
       <w:r>
-        <w:t xml:space="preserve">Ma matière préférée est sans aucun doute les langues, en particulier le français et l’espagnol. Notre professeur de langues, AP, est exceptionnel, il sait vraiment comment rendre les cours passionnants et interactifs.</w:t>
+        <w:t xml:space="preserve">Ma matière préférée est sans aucun doute les langues, en particulier le français et l’espagnol. Notre professeur de langues est exceptionnel, il sait vraiment comment rendre les cours passionnants et interactifs.</w:t>
       </w:r>
     </w:p>
     <w:p>

</xml_diff>